<commit_message>
Generando y optimizando juegos_deportivos_aleatorio_interpretacion_representacion_n2_opcA_v1.Rmd y juegos_deportivos_aleatorio_interpretacion_representacion_n2_opcB_v1.Rmd
</commit_message>
<xml_diff>
--- a/Lab/15-S1-2025-SEDQ/salida/juegos_deportivos_aleatorio_interpretacion_representacion_n2_opcA_v1_1.docx
+++ b/Lab/15-S1-2025-SEDQ/salida/juegos_deportivos_aleatorio_interpretacion_representacion_n2_opcA_v1_1.docx
@@ -53,7 +53,7 @@
         <w:br/>
       </w:r>
       <w:r>
-        <w:t xml:space="preserve">los Juegos Olímpicos se realizan cada cuatro años con la participación de países de mundial, alternando las sedes deportivas. La tabla muestra algunos datos de las últimas cinco versiones de los Juegos Olímpicos:</w:t>
+        <w:t xml:space="preserve">los Juegos Centroamericanos se realizan cada cuatro años con la participación de países de Centroamérica, alternando las sedes deportivas. La tabla muestra algunos datos de las últimas cinco versiones de los Juegos Centroamericanos:</w:t>
       </w:r>
     </w:p>
     <w:p>
@@ -114,7 +114,7 @@
         </w:numPr>
       </w:pPr>
       <w:r>
-        <w:t xml:space="preserve">Del total de atletas participantes en 2029, el 9% compite en gimnasia. Para determinar el número de atletas de gimnasia ese año, se sugiere multiplicar 0.9 por el número de atletas que participaron en 2029. El procedimiento sugerido es:</w:t>
+        <w:t xml:space="preserve">Del total de atletas participantes en 2024, el 5% compite en atletismo. Para determinar el número de atletas de atletismo ese año, se sugiere multiplicar 0.5 por el número de atletas que participaron en 2024. El procedimiento sugerido es:</w:t>
       </w:r>
     </w:p>
     <w:p>
@@ -125,7 +125,7 @@
         </w:numPr>
       </w:pPr>
       <w:r>
-        <w:t xml:space="preserve">incorrecto, porque se debe multiplicar 0.09 por el número de atletas participantes</w:t>
+        <w:t xml:space="preserve">insuficiente, porque falta multiplicar el resultado por el número de países participantes en 2024</w:t>
       </w:r>
     </w:p>
     <w:p>
@@ -136,7 +136,7 @@
         </w:numPr>
       </w:pPr>
       <w:r>
-        <w:t xml:space="preserve">correcto, solamente si el resultado obtenido es un número exacto de atletas en gimnasia</w:t>
+        <w:t xml:space="preserve">correcto, pero solo si se redondea al número entero más cercano de competidores</w:t>
       </w:r>
     </w:p>
     <w:p>
@@ -147,7 +147,7 @@
         </w:numPr>
       </w:pPr>
       <w:r>
-        <w:t xml:space="preserve">insuficiente, porque falta multiplicar el resultado por el número de países participantes en 2029</w:t>
+        <w:t xml:space="preserve">insuficiente, porque falta considerar el número total de deportes en el evento</w:t>
       </w:r>
     </w:p>
     <w:p>
@@ -158,7 +158,7 @@
         </w:numPr>
       </w:pPr>
       <w:r>
-        <w:t xml:space="preserve">insuficiente, porque falta considerar el número total de deportes en el evento</w:t>
+        <w:t xml:space="preserve">incorrecto, porque se debe multiplicar 0.05 por el número de atletas participantes</w:t>
       </w:r>
     </w:p>
     <w:p>
@@ -179,7 +179,7 @@
         <w:br/>
       </w:r>
       <w:r>
-        <w:t xml:space="preserve">Para resolver este problema, necesitamos evaluar si el procedimiento propuesto para calcular el número de atletas que compiten en gimnasia es matemáticamente correcto.</w:t>
+        <w:t xml:space="preserve">Para resolver este problema, necesitamos evaluar si el procedimiento propuesto para calcular el número de atletas que compiten en atletismo es matemáticamente correcto.</w:t>
       </w:r>
     </w:p>
     <w:p>
@@ -219,7 +219,7 @@
         </w:numPr>
       </w:pPr>
       <w:r>
-        <w:t xml:space="preserve">Total de atletas en 2029: 5.219</w:t>
+        <w:t xml:space="preserve">Total de atletas en 2024: 7.882</w:t>
       </w:r>
     </w:p>
     <w:p>
@@ -230,7 +230,7 @@
         </w:numPr>
       </w:pPr>
       <w:r>
-        <w:t xml:space="preserve">Porcentaje que compite en gimnasia: 9%</w:t>
+        <w:t xml:space="preserve">Porcentaje que compite en atletismo: 5%</w:t>
       </w:r>
     </w:p>
     <w:p>
@@ -241,7 +241,7 @@
         </w:numPr>
       </w:pPr>
       <w:r>
-        <w:t xml:space="preserve">Procedimiento sugerido: multiplicar 0.9 por 5.219</w:t>
+        <w:t xml:space="preserve">Procedimiento sugerido: multiplicar 0.5 por 7.882</w:t>
       </w:r>
     </w:p>
     <w:p>
@@ -281,7 +281,7 @@
         </w:numPr>
       </w:pPr>
       <w:r>
-        <w:t xml:space="preserve">El procedimiento propone multiplicar 0.9 por el total de atletas, pero esto es</w:t>
+        <w:t xml:space="preserve">El procedimiento propone multiplicar 0.5 por el total de atletas, pero esto es</w:t>
       </w:r>
       <w:r>
         <w:t xml:space="preserve"> </w:t>
@@ -331,7 +331,7 @@
         </w:numPr>
       </w:pPr>
       <w:r>
-        <w:t xml:space="preserve">9% = 0.09 (no 0.9)</w:t>
+        <w:t xml:space="preserve">5% = 0.05 (no 0.5)</w:t>
       </w:r>
     </w:p>
     <w:p>
@@ -352,7 +352,7 @@
         <w:t xml:space="preserve"> </w:t>
       </w:r>
       <w:r>
-        <w:t xml:space="preserve">9% de 5.219 = 0.09 × 5.219 = 470</w:t>
+        <w:t xml:space="preserve">5% de 7.882 = 0.05 × 7.882 = 394</w:t>
       </w:r>
     </w:p>
     <w:p>
@@ -373,7 +373,7 @@
         <w:t xml:space="preserve"> </w:t>
       </w:r>
       <w:r>
-        <w:t xml:space="preserve">0.9 × 5.219 = 4.697 (esto sería el 90%, no el 9%)</w:t>
+        <w:t xml:space="preserve">0.5 × 7.882 = 3.941 (esto sería el 50%, no el 5%)</w:t>
       </w:r>
     </w:p>
     <w:p>
@@ -440,7 +440,7 @@
         </w:numPr>
       </w:pPr>
       <w:r>
-        <w:t xml:space="preserve">El valor 0.9 corresponde al 90%, no al 9%</w:t>
+        <w:t xml:space="preserve">El valor 0.5 corresponde al 50%, no al 5%</w:t>
       </w:r>
     </w:p>
     <w:p>
@@ -451,7 +451,7 @@
         </w:numPr>
       </w:pPr>
       <w:r>
-        <w:t xml:space="preserve">Para calcular el 9% se debe usar 0.09, no 0.9</w:t>
+        <w:t xml:space="preserve">Para calcular el 5% se debe usar 0.05, no 0.5</w:t>
       </w:r>
     </w:p>
     <w:p>
@@ -632,7 +632,7 @@
         <w:t xml:space="preserve"> </w:t>
       </w:r>
       <w:r>
-        <w:t xml:space="preserve">porque usa 0.9 en lugar de 0.09. La respuesta correcta identifica este error y proporciona el valor decimal correcto que debe usarse.</w:t>
+        <w:t xml:space="preserve">porque usa 0.5 en lugar de 0.05. La respuesta correcta identifica este error y proporciona el valor decimal correcto que debe usarse.</w:t>
       </w:r>
     </w:p>
     <w:p>
@@ -643,45 +643,45 @@
         </w:numPr>
       </w:pPr>
       <w:r>
+        <w:t xml:space="preserve">Falso</w:t>
+      </w:r>
+    </w:p>
+    <w:p>
+      <w:pPr>
+        <w:numPr>
+          <w:ilvl w:val="1"/>
+          <w:numId w:val="1007"/>
+        </w:numPr>
+      </w:pPr>
+      <w:r>
+        <w:t xml:space="preserve">Falso</w:t>
+      </w:r>
+    </w:p>
+    <w:p>
+      <w:pPr>
+        <w:numPr>
+          <w:ilvl w:val="1"/>
+          <w:numId w:val="1007"/>
+        </w:numPr>
+      </w:pPr>
+      <w:r>
+        <w:t xml:space="preserve">Falso</w:t>
+      </w:r>
+    </w:p>
+    <w:p>
+      <w:pPr>
+        <w:numPr>
+          <w:ilvl w:val="1"/>
+          <w:numId w:val="1007"/>
+        </w:numPr>
+      </w:pPr>
+      <w:r>
         <w:t xml:space="preserve">Verdadero</w:t>
       </w:r>
     </w:p>
     <w:p>
       <w:pPr>
         <w:numPr>
-          <w:ilvl w:val="1"/>
-          <w:numId w:val="1007"/>
-        </w:numPr>
-      </w:pPr>
-      <w:r>
-        <w:t xml:space="preserve">Falso</w:t>
-      </w:r>
-    </w:p>
-    <w:p>
-      <w:pPr>
-        <w:numPr>
-          <w:ilvl w:val="1"/>
-          <w:numId w:val="1007"/>
-        </w:numPr>
-      </w:pPr>
-      <w:r>
-        <w:t xml:space="preserve">Falso</w:t>
-      </w:r>
-    </w:p>
-    <w:p>
-      <w:pPr>
-        <w:numPr>
-          <w:ilvl w:val="1"/>
-          <w:numId w:val="1007"/>
-        </w:numPr>
-      </w:pPr>
-      <w:r>
-        <w:t xml:space="preserve">Falso</w:t>
-      </w:r>
-    </w:p>
-    <w:p>
-      <w:pPr>
-        <w:numPr>
           <w:ilvl w:val="0"/>
           <w:numId w:val="1001"/>
         </w:numPr>
@@ -697,7 +697,7 @@
         <w:br/>
       </w:r>
       <w:r>
-        <w:t xml:space="preserve">los Juegos Suramericanos se realizan cada cuatro años con la participación de países de Suramérica, alternando las sedes deportivas. La tabla muestra algunos datos de las últimas cinco versiones de los Juegos Suramericanos:</w:t>
+        <w:t xml:space="preserve">los Juegos Mediterráneos se realizan cada cuatro años con la participación de países de Mediterráneo, alternando las sedes deportivas. La tabla muestra algunos datos de las últimas cinco versiones de los Juegos Mediterráneos:</w:t>
       </w:r>
     </w:p>
     <w:p>
@@ -710,7 +710,7 @@
       <w:r>
         <w:drawing>
           <wp:inline>
-            <wp:extent cx="4267200" cy="2540205"/>
+            <wp:extent cx="4267200" cy="2537331"/>
             <wp:effectExtent b="0" l="0" r="0" t="0"/>
             <wp:docPr descr="image" title="" id="28" name="Picture"/>
             <a:graphic>
@@ -731,7 +731,7 @@
                   <pic:spPr bwMode="auto">
                     <a:xfrm>
                       <a:off x="0" y="0"/>
-                      <a:ext cx="4267200" cy="2540205"/>
+                      <a:ext cx="4267200" cy="2537331"/>
                     </a:xfrm>
                     <a:prstGeom prst="rect">
                       <a:avLst/>
@@ -758,7 +758,7 @@
         </w:numPr>
       </w:pPr>
       <w:r>
-        <w:t xml:space="preserve">Del total de atletas participantes en 2031, el 7% compite en atletismo. Para determinar el número de atletas de atletismo ese año, se sugiere multiplicar 0.7 por el número de atletas que participaron en 2031. El procedimiento sugerido es:</w:t>
+        <w:t xml:space="preserve">Del total de atletas participantes en 2015, el 6% compite en atletismo. Para determinar el número de atletas de atletismo ese año, se sugiere multiplicar 0.6 por el número de atletas que participaron en 2015. El procedimiento sugerido es:</w:t>
       </w:r>
     </w:p>
     <w:p>
@@ -769,6 +769,17 @@
         </w:numPr>
       </w:pPr>
       <w:r>
+        <w:t xml:space="preserve">suficiente para determinar el número de atletas que participó en atletismo en el año 2015</w:t>
+      </w:r>
+    </w:p>
+    <w:p>
+      <w:pPr>
+        <w:numPr>
+          <w:ilvl w:val="1"/>
+          <w:numId w:val="1008"/>
+        </w:numPr>
+      </w:pPr>
+      <w:r>
         <w:t xml:space="preserve">correcto, pero solo si se redondea al número entero más cercano de competidores</w:t>
       </w:r>
     </w:p>
@@ -780,7 +791,7 @@
         </w:numPr>
       </w:pPr>
       <w:r>
-        <w:t xml:space="preserve">insuficiente, porque se debe dividir entre el número de deportes practicados en 2031</w:t>
+        <w:t xml:space="preserve">incorrecto, porque se debe multiplicar 0.06 por el número de atletas participantes</w:t>
       </w:r>
     </w:p>
     <w:p>
@@ -791,18 +802,7 @@
         </w:numPr>
       </w:pPr>
       <w:r>
-        <w:t xml:space="preserve">incorrecto, porque se debe multiplicar 0.07 por el número de atletas participantes</w:t>
-      </w:r>
-    </w:p>
-    <w:p>
-      <w:pPr>
-        <w:numPr>
-          <w:ilvl w:val="1"/>
-          <w:numId w:val="1008"/>
-        </w:numPr>
-      </w:pPr>
-      <w:r>
-        <w:t xml:space="preserve">suficiente para determinar el número de atletas que participó en atletismo en el año 2031</w:t>
+        <w:t xml:space="preserve">insuficiente, porque falta multiplicar el resultado por el número de países participantes en 2015</w:t>
       </w:r>
     </w:p>
     <w:p>
@@ -863,7 +863,7 @@
         </w:numPr>
       </w:pPr>
       <w:r>
-        <w:t xml:space="preserve">Total de atletas en 2031: 4.663</w:t>
+        <w:t xml:space="preserve">Total de atletas en 2015: 7.066</w:t>
       </w:r>
     </w:p>
     <w:p>
@@ -874,7 +874,7 @@
         </w:numPr>
       </w:pPr>
       <w:r>
-        <w:t xml:space="preserve">Porcentaje que compite en atletismo: 7%</w:t>
+        <w:t xml:space="preserve">Porcentaje que compite en atletismo: 6%</w:t>
       </w:r>
     </w:p>
     <w:p>
@@ -885,7 +885,7 @@
         </w:numPr>
       </w:pPr>
       <w:r>
-        <w:t xml:space="preserve">Procedimiento sugerido: multiplicar 0.7 por 4.663</w:t>
+        <w:t xml:space="preserve">Procedimiento sugerido: multiplicar 0.6 por 7.066</w:t>
       </w:r>
     </w:p>
     <w:p>
@@ -925,7 +925,7 @@
         </w:numPr>
       </w:pPr>
       <w:r>
-        <w:t xml:space="preserve">El procedimiento propone multiplicar 0.7 por el total de atletas, pero esto es</w:t>
+        <w:t xml:space="preserve">El procedimiento propone multiplicar 0.6 por el total de atletas, pero esto es</w:t>
       </w:r>
       <w:r>
         <w:t xml:space="preserve"> </w:t>
@@ -975,7 +975,7 @@
         </w:numPr>
       </w:pPr>
       <w:r>
-        <w:t xml:space="preserve">7% = 0.07 (no 0.7)</w:t>
+        <w:t xml:space="preserve">6% = 0.06 (no 0.6)</w:t>
       </w:r>
     </w:p>
     <w:p>
@@ -996,7 +996,7 @@
         <w:t xml:space="preserve"> </w:t>
       </w:r>
       <w:r>
-        <w:t xml:space="preserve">7% de 4.663 = 0.07 × 4.663 = 326</w:t>
+        <w:t xml:space="preserve">6% de 7.066 = 0.06 × 7.066 = 424</w:t>
       </w:r>
     </w:p>
     <w:p>
@@ -1017,7 +1017,7 @@
         <w:t xml:space="preserve"> </w:t>
       </w:r>
       <w:r>
-        <w:t xml:space="preserve">0.7 × 4.663 = 3.264 (esto sería el 70%, no el 7%)</w:t>
+        <w:t xml:space="preserve">0.6 × 7.066 = 4.240 (esto sería el 60%, no el 6%)</w:t>
       </w:r>
     </w:p>
     <w:p>
@@ -1084,7 +1084,7 @@
         </w:numPr>
       </w:pPr>
       <w:r>
-        <w:t xml:space="preserve">El valor 0.7 corresponde al 70%, no al 7%</w:t>
+        <w:t xml:space="preserve">El valor 0.6 corresponde al 60%, no al 6%</w:t>
       </w:r>
     </w:p>
     <w:p>
@@ -1095,7 +1095,7 @@
         </w:numPr>
       </w:pPr>
       <w:r>
-        <w:t xml:space="preserve">Para calcular el 7% se debe usar 0.07, no 0.7</w:t>
+        <w:t xml:space="preserve">Para calcular el 6% se debe usar 0.06, no 0.6</w:t>
       </w:r>
     </w:p>
     <w:p>
@@ -1276,7 +1276,7 @@
         <w:t xml:space="preserve"> </w:t>
       </w:r>
       <w:r>
-        <w:t xml:space="preserve">porque usa 0.7 en lugar de 0.07. La respuesta correcta identifica este error y proporciona el valor decimal correcto que debe usarse.</w:t>
+        <w:t xml:space="preserve">porque usa 0.6 en lugar de 0.06. La respuesta correcta identifica este error y proporciona el valor decimal correcto que debe usarse.</w:t>
       </w:r>
     </w:p>
     <w:p>
@@ -1341,7 +1341,7 @@
         <w:br/>
       </w:r>
       <w:r>
-        <w:t xml:space="preserve">los Juegos Europeos se realizan cada cuatro años con la participación de países de Europa, alternando las sedes deportivas. La tabla muestra algunos datos de las últimas cinco versiones de los Juegos Europeos:</w:t>
+        <w:t xml:space="preserve">los Juegos Panamericanos se realizan cada cuatro años con la participación de países de América, alternando las sedes deportivas. La tabla muestra algunos datos de las últimas cinco versiones de los Juegos Panamericanos:</w:t>
       </w:r>
     </w:p>
     <w:p>
@@ -1402,7 +1402,7 @@
         </w:numPr>
       </w:pPr>
       <w:r>
-        <w:t xml:space="preserve">Del total de atletas participantes en 2027, el 9% compite en taekwondo. Para determinar el número de atletas de taekwondo ese año, se sugiere multiplicar 0.9 por el número de atletas que participaron en 2027. El procedimiento sugerido es:</w:t>
+        <w:t xml:space="preserve">Del total de atletas participantes en 2021, el 5% compite en remo. Para determinar el número de atletas de remo ese año, se sugiere multiplicar 0.5 por el número de atletas que participaron en 2021. El procedimiento sugerido es:</w:t>
       </w:r>
     </w:p>
     <w:p>
@@ -1413,7 +1413,7 @@
         </w:numPr>
       </w:pPr>
       <w:r>
-        <w:t xml:space="preserve">correcto, solamente si el resultado obtenido es un número exacto de atletas en taekwondo</w:t>
+        <w:t xml:space="preserve">incorrecto, porque se debe multiplicar 0.05 por el número de atletas participantes</w:t>
       </w:r>
     </w:p>
     <w:p>
@@ -1424,7 +1424,7 @@
         </w:numPr>
       </w:pPr>
       <w:r>
-        <w:t xml:space="preserve">incorrecto, porque se debe multiplicar 0.09 por el número de atletas participantes</w:t>
+        <w:t xml:space="preserve">correcto, solamente si el resultado obtenido es un número exacto de atletas en remo</w:t>
       </w:r>
     </w:p>
     <w:p>
@@ -1435,7 +1435,7 @@
         </w:numPr>
       </w:pPr>
       <w:r>
-        <w:t xml:space="preserve">suficiente para determinar el número de atletas que participó en taekwondo en el año 2027</w:t>
+        <w:t xml:space="preserve">insuficiente, porque falta multiplicar el resultado por el número de países participantes en 2021</w:t>
       </w:r>
     </w:p>
     <w:p>
@@ -1446,7 +1446,7 @@
         </w:numPr>
       </w:pPr>
       <w:r>
-        <w:t xml:space="preserve">insuficiente, porque se debe dividir entre el número de deportes practicados en 2027</w:t>
+        <w:t xml:space="preserve">correcto, pero solo si se redondea al número entero más cercano de competidores</w:t>
       </w:r>
     </w:p>
     <w:p>
@@ -1467,7 +1467,7 @@
         <w:br/>
       </w:r>
       <w:r>
-        <w:t xml:space="preserve">Para resolver este problema, necesitamos evaluar si el procedimiento propuesto para calcular el número de atletas que compiten en taekwondo es matemáticamente correcto.</w:t>
+        <w:t xml:space="preserve">Para resolver este problema, necesitamos evaluar si el procedimiento propuesto para calcular el número de atletas que compiten en remo es matemáticamente correcto.</w:t>
       </w:r>
     </w:p>
     <w:p>
@@ -1507,7 +1507,7 @@
         </w:numPr>
       </w:pPr>
       <w:r>
-        <w:t xml:space="preserve">Total de atletas en 2027: 5.558</w:t>
+        <w:t xml:space="preserve">Total de atletas en 2021: 6.906</w:t>
       </w:r>
     </w:p>
     <w:p>
@@ -1518,7 +1518,7 @@
         </w:numPr>
       </w:pPr>
       <w:r>
-        <w:t xml:space="preserve">Porcentaje que compite en taekwondo: 9%</w:t>
+        <w:t xml:space="preserve">Porcentaje que compite en remo: 5%</w:t>
       </w:r>
     </w:p>
     <w:p>
@@ -1529,7 +1529,7 @@
         </w:numPr>
       </w:pPr>
       <w:r>
-        <w:t xml:space="preserve">Procedimiento sugerido: multiplicar 0.9 por 5.558</w:t>
+        <w:t xml:space="preserve">Procedimiento sugerido: multiplicar 0.5 por 6.906</w:t>
       </w:r>
     </w:p>
     <w:p>
@@ -1569,7 +1569,7 @@
         </w:numPr>
       </w:pPr>
       <w:r>
-        <w:t xml:space="preserve">El procedimiento propone multiplicar 0.9 por el total de atletas, pero esto es</w:t>
+        <w:t xml:space="preserve">El procedimiento propone multiplicar 0.5 por el total de atletas, pero esto es</w:t>
       </w:r>
       <w:r>
         <w:t xml:space="preserve"> </w:t>
@@ -1619,7 +1619,7 @@
         </w:numPr>
       </w:pPr>
       <w:r>
-        <w:t xml:space="preserve">9% = 0.09 (no 0.9)</w:t>
+        <w:t xml:space="preserve">5% = 0.05 (no 0.5)</w:t>
       </w:r>
     </w:p>
     <w:p>
@@ -1640,7 +1640,7 @@
         <w:t xml:space="preserve"> </w:t>
       </w:r>
       <w:r>
-        <w:t xml:space="preserve">9% de 5.558 = 0.09 × 5.558 = 500</w:t>
+        <w:t xml:space="preserve">5% de 6.906 = 0.05 × 6.906 = 345</w:t>
       </w:r>
     </w:p>
     <w:p>
@@ -1661,7 +1661,7 @@
         <w:t xml:space="preserve"> </w:t>
       </w:r>
       <w:r>
-        <w:t xml:space="preserve">0.9 × 5.558 = 5.002 (esto sería el 90%, no el 9%)</w:t>
+        <w:t xml:space="preserve">0.5 × 6.906 = 3.453 (esto sería el 50%, no el 5%)</w:t>
       </w:r>
     </w:p>
     <w:p>
@@ -1728,7 +1728,7 @@
         </w:numPr>
       </w:pPr>
       <w:r>
-        <w:t xml:space="preserve">El valor 0.9 corresponde al 90%, no al 9%</w:t>
+        <w:t xml:space="preserve">El valor 0.5 corresponde al 50%, no al 5%</w:t>
       </w:r>
     </w:p>
     <w:p>
@@ -1739,7 +1739,7 @@
         </w:numPr>
       </w:pPr>
       <w:r>
-        <w:t xml:space="preserve">Para calcular el 9% se debe usar 0.09, no 0.9</w:t>
+        <w:t xml:space="preserve">Para calcular el 5% se debe usar 0.05, no 0.5</w:t>
       </w:r>
     </w:p>
     <w:p>
@@ -1920,7 +1920,7 @@
         <w:t xml:space="preserve"> </w:t>
       </w:r>
       <w:r>
-        <w:t xml:space="preserve">porque usa 0.9 en lugar de 0.09. La respuesta correcta identifica este error y proporciona el valor decimal correcto que debe usarse.</w:t>
+        <w:t xml:space="preserve">porque usa 0.5 en lugar de 0.05. La respuesta correcta identifica este error y proporciona el valor decimal correcto que debe usarse.</w:t>
       </w:r>
     </w:p>
     <w:p>
@@ -1931,6 +1931,17 @@
         </w:numPr>
       </w:pPr>
       <w:r>
+        <w:t xml:space="preserve">Verdadero</w:t>
+      </w:r>
+    </w:p>
+    <w:p>
+      <w:pPr>
+        <w:numPr>
+          <w:ilvl w:val="1"/>
+          <w:numId w:val="1019"/>
+        </w:numPr>
+      </w:pPr>
+      <w:r>
         <w:t xml:space="preserve">Falso</w:t>
       </w:r>
     </w:p>
@@ -1942,7 +1953,7 @@
         </w:numPr>
       </w:pPr>
       <w:r>
-        <w:t xml:space="preserve">Verdadero</w:t>
+        <w:t xml:space="preserve">Falso</w:t>
       </w:r>
     </w:p>
     <w:p>
@@ -1959,17 +1970,6 @@
     <w:p>
       <w:pPr>
         <w:numPr>
-          <w:ilvl w:val="1"/>
-          <w:numId w:val="1019"/>
-        </w:numPr>
-      </w:pPr>
-      <w:r>
-        <w:t xml:space="preserve">Falso</w:t>
-      </w:r>
-    </w:p>
-    <w:p>
-      <w:pPr>
-        <w:numPr>
           <w:ilvl w:val="0"/>
           <w:numId w:val="1001"/>
         </w:numPr>
@@ -1985,7 +1985,7 @@
         <w:br/>
       </w:r>
       <w:r>
-        <w:t xml:space="preserve">el Campeonato Mundial de Atletismo se realizan cada cuatro años con la participación de países de mundial, alternando las sedes deportivas. La tabla muestra algunos datos de las últimas cinco versiones de el Campeonato Mundial de Atletismo:</w:t>
+        <w:t xml:space="preserve">los Juegos Africanos se realizan cada cuatro años con la participación de países de África, alternando las sedes deportivas. La tabla muestra algunos datos de las últimas cinco versiones de los Juegos Africanos:</w:t>
       </w:r>
     </w:p>
     <w:p>
@@ -2046,7 +2046,7 @@
         </w:numPr>
       </w:pPr>
       <w:r>
-        <w:t xml:space="preserve">Del total de atletas participantes en 2033, el 5% compite en tiro. Para determinar el número de atletas de tiro ese año, se sugiere multiplicar 0.5 por el número de atletas que participaron en 2033. El procedimiento sugerido es:</w:t>
+        <w:t xml:space="preserve">Del total de atletas participantes en 2019, el 6% compite en atletismo. Para determinar el número de atletas de atletismo ese año, se sugiere multiplicar 0.6 por el número de atletas que participaron en 2019. El procedimiento sugerido es:</w:t>
       </w:r>
     </w:p>
     <w:p>
@@ -2057,45 +2057,45 @@
         </w:numPr>
       </w:pPr>
       <w:r>
+        <w:t xml:space="preserve">incorrecto, porque se debe multiplicar 0.06 por el número de atletas participantes</w:t>
+      </w:r>
+    </w:p>
+    <w:p>
+      <w:pPr>
+        <w:numPr>
+          <w:ilvl w:val="1"/>
+          <w:numId w:val="1020"/>
+        </w:numPr>
+      </w:pPr>
+      <w:r>
+        <w:t xml:space="preserve">insuficiente, porque se debe dividir entre el número de deportes practicados en 2019</w:t>
+      </w:r>
+    </w:p>
+    <w:p>
+      <w:pPr>
+        <w:numPr>
+          <w:ilvl w:val="1"/>
+          <w:numId w:val="1020"/>
+        </w:numPr>
+      </w:pPr>
+      <w:r>
+        <w:t xml:space="preserve">correcto, solamente si el resultado obtenido es un número exacto de atletas en atletismo</w:t>
+      </w:r>
+    </w:p>
+    <w:p>
+      <w:pPr>
+        <w:numPr>
+          <w:ilvl w:val="1"/>
+          <w:numId w:val="1020"/>
+        </w:numPr>
+      </w:pPr>
+      <w:r>
         <w:t xml:space="preserve">correcto, pero solo si se redondea al número entero más cercano de competidores</w:t>
       </w:r>
     </w:p>
     <w:p>
       <w:pPr>
         <w:numPr>
-          <w:ilvl w:val="1"/>
-          <w:numId w:val="1020"/>
-        </w:numPr>
-      </w:pPr>
-      <w:r>
-        <w:t xml:space="preserve">incorrecto, porque se debe multiplicar 0.05 por el número de atletas participantes</w:t>
-      </w:r>
-    </w:p>
-    <w:p>
-      <w:pPr>
-        <w:numPr>
-          <w:ilvl w:val="1"/>
-          <w:numId w:val="1020"/>
-        </w:numPr>
-      </w:pPr>
-      <w:r>
-        <w:t xml:space="preserve">insuficiente, porque se debe dividir entre el número de deportes practicados en 2033</w:t>
-      </w:r>
-    </w:p>
-    <w:p>
-      <w:pPr>
-        <w:numPr>
-          <w:ilvl w:val="1"/>
-          <w:numId w:val="1020"/>
-        </w:numPr>
-      </w:pPr>
-      <w:r>
-        <w:t xml:space="preserve">insuficiente, porque se debe calcular el promedio de atletas por país participante</w:t>
-      </w:r>
-    </w:p>
-    <w:p>
-      <w:pPr>
-        <w:numPr>
           <w:ilvl w:val="0"/>
           <w:numId w:val="1000"/>
         </w:numPr>
@@ -2111,7 +2111,7 @@
         <w:br/>
       </w:r>
       <w:r>
-        <w:t xml:space="preserve">Para resolver este problema, necesitamos evaluar si el procedimiento propuesto para calcular el número de atletas que compiten en tiro es matemáticamente correcto.</w:t>
+        <w:t xml:space="preserve">Para resolver este problema, necesitamos evaluar si el procedimiento propuesto para calcular el número de atletas que compiten en atletismo es matemáticamente correcto.</w:t>
       </w:r>
     </w:p>
     <w:p>
@@ -2151,7 +2151,7 @@
         </w:numPr>
       </w:pPr>
       <w:r>
-        <w:t xml:space="preserve">Total de atletas en 2033: 7.893</w:t>
+        <w:t xml:space="preserve">Total de atletas en 2019: 5.687</w:t>
       </w:r>
     </w:p>
     <w:p>
@@ -2162,7 +2162,7 @@
         </w:numPr>
       </w:pPr>
       <w:r>
-        <w:t xml:space="preserve">Porcentaje que compite en tiro: 5%</w:t>
+        <w:t xml:space="preserve">Porcentaje que compite en atletismo: 6%</w:t>
       </w:r>
     </w:p>
     <w:p>
@@ -2173,7 +2173,7 @@
         </w:numPr>
       </w:pPr>
       <w:r>
-        <w:t xml:space="preserve">Procedimiento sugerido: multiplicar 0.5 por 7.893</w:t>
+        <w:t xml:space="preserve">Procedimiento sugerido: multiplicar 0.6 por 5.687</w:t>
       </w:r>
     </w:p>
     <w:p>
@@ -2213,7 +2213,7 @@
         </w:numPr>
       </w:pPr>
       <w:r>
-        <w:t xml:space="preserve">El procedimiento propone multiplicar 0.5 por el total de atletas, pero esto es</w:t>
+        <w:t xml:space="preserve">El procedimiento propone multiplicar 0.6 por el total de atletas, pero esto es</w:t>
       </w:r>
       <w:r>
         <w:t xml:space="preserve"> </w:t>
@@ -2263,7 +2263,7 @@
         </w:numPr>
       </w:pPr>
       <w:r>
-        <w:t xml:space="preserve">5% = 0.05 (no 0.5)</w:t>
+        <w:t xml:space="preserve">6% = 0.06 (no 0.6)</w:t>
       </w:r>
     </w:p>
     <w:p>
@@ -2284,7 +2284,7 @@
         <w:t xml:space="preserve"> </w:t>
       </w:r>
       <w:r>
-        <w:t xml:space="preserve">5% de 7.893 = 0.05 × 7.893 = 395</w:t>
+        <w:t xml:space="preserve">6% de 5.687 = 0.06 × 5.687 = 341</w:t>
       </w:r>
     </w:p>
     <w:p>
@@ -2305,7 +2305,7 @@
         <w:t xml:space="preserve"> </w:t>
       </w:r>
       <w:r>
-        <w:t xml:space="preserve">0.5 × 7.893 = 3.947 (esto sería el 50%, no el 5%)</w:t>
+        <w:t xml:space="preserve">0.6 × 5.687 = 3.412 (esto sería el 60%, no el 6%)</w:t>
       </w:r>
     </w:p>
     <w:p>
@@ -2372,7 +2372,7 @@
         </w:numPr>
       </w:pPr>
       <w:r>
-        <w:t xml:space="preserve">El valor 0.5 corresponde al 50%, no al 5%</w:t>
+        <w:t xml:space="preserve">El valor 0.6 corresponde al 60%, no al 6%</w:t>
       </w:r>
     </w:p>
     <w:p>
@@ -2383,7 +2383,7 @@
         </w:numPr>
       </w:pPr>
       <w:r>
-        <w:t xml:space="preserve">Para calcular el 5% se debe usar 0.05, no 0.5</w:t>
+        <w:t xml:space="preserve">Para calcular el 6% se debe usar 0.06, no 0.6</w:t>
       </w:r>
     </w:p>
     <w:p>
@@ -2564,7 +2564,7 @@
         <w:t xml:space="preserve"> </w:t>
       </w:r>
       <w:r>
-        <w:t xml:space="preserve">porque usa 0.5 en lugar de 0.05. La respuesta correcta identifica este error y proporciona el valor decimal correcto que debe usarse.</w:t>
+        <w:t xml:space="preserve">porque usa 0.6 en lugar de 0.06. La respuesta correcta identifica este error y proporciona el valor decimal correcto que debe usarse.</w:t>
       </w:r>
     </w:p>
     <w:p>
@@ -2575,6 +2575,17 @@
         </w:numPr>
       </w:pPr>
       <w:r>
+        <w:t xml:space="preserve">Verdadero</w:t>
+      </w:r>
+    </w:p>
+    <w:p>
+      <w:pPr>
+        <w:numPr>
+          <w:ilvl w:val="1"/>
+          <w:numId w:val="1025"/>
+        </w:numPr>
+      </w:pPr>
+      <w:r>
         <w:t xml:space="preserve">Falso</w:t>
       </w:r>
     </w:p>
@@ -2586,7 +2597,7 @@
         </w:numPr>
       </w:pPr>
       <w:r>
-        <w:t xml:space="preserve">Verdadero</w:t>
+        <w:t xml:space="preserve">Falso</w:t>
       </w:r>
     </w:p>
     <w:p>
@@ -2603,17 +2614,6 @@
     <w:p>
       <w:pPr>
         <w:numPr>
-          <w:ilvl w:val="1"/>
-          <w:numId w:val="1025"/>
-        </w:numPr>
-      </w:pPr>
-      <w:r>
-        <w:t xml:space="preserve">Falso</w:t>
-      </w:r>
-    </w:p>
-    <w:p>
-      <w:pPr>
-        <w:numPr>
           <w:ilvl w:val="0"/>
           <w:numId w:val="1001"/>
         </w:numPr>
@@ -2629,7 +2629,7 @@
         <w:br/>
       </w:r>
       <w:r>
-        <w:t xml:space="preserve">los Juegos Mediterráneos se realizan cada cuatro años con la participación de países de Mediterráneo, alternando las sedes deportivas. La tabla muestra algunos datos de las últimas cinco versiones de los Juegos Mediterráneos:</w:t>
+        <w:t xml:space="preserve">los Juegos Africanos se realizan cada cuatro años con la participación de países de África, alternando las sedes deportivas. La tabla muestra algunos datos de las últimas cinco versiones de los Juegos Africanos:</w:t>
       </w:r>
     </w:p>
     <w:p>
@@ -2642,7 +2642,7 @@
       <w:r>
         <w:drawing>
           <wp:inline>
-            <wp:extent cx="4267200" cy="2537331"/>
+            <wp:extent cx="4267200" cy="2540205"/>
             <wp:effectExtent b="0" l="0" r="0" t="0"/>
             <wp:docPr descr="image" title="" id="49" name="Picture"/>
             <a:graphic>
@@ -2663,7 +2663,7 @@
                   <pic:spPr bwMode="auto">
                     <a:xfrm>
                       <a:off x="0" y="0"/>
-                      <a:ext cx="4267200" cy="2537331"/>
+                      <a:ext cx="4267200" cy="2540205"/>
                     </a:xfrm>
                     <a:prstGeom prst="rect">
                       <a:avLst/>
@@ -2690,7 +2690,7 @@
         </w:numPr>
       </w:pPr>
       <w:r>
-        <w:t xml:space="preserve">Del total de atletas participantes en 2027, el 8% compite en atletismo. Para determinar el número de atletas de atletismo ese año, se sugiere multiplicar 0.8 por el número de atletas que participaron en 2027. El procedimiento sugerido es:</w:t>
+        <w:t xml:space="preserve">Del total de atletas participantes en 2020, el 7% compite en natación. Para determinar el número de atletas de natación ese año, se sugiere multiplicar 0.7 por el número de atletas que participaron en 2020. El procedimiento sugerido es:</w:t>
       </w:r>
     </w:p>
     <w:p>
@@ -2701,7 +2701,7 @@
         </w:numPr>
       </w:pPr>
       <w:r>
-        <w:t xml:space="preserve">insuficiente, porque falta multiplicar el resultado por el número de países participantes en 2027</w:t>
+        <w:t xml:space="preserve">insuficiente, porque falta multiplicar el resultado por el número de países participantes en 2020</w:t>
       </w:r>
     </w:p>
     <w:p>
@@ -2712,34 +2712,34 @@
         </w:numPr>
       </w:pPr>
       <w:r>
+        <w:t xml:space="preserve">insuficiente, porque se debe dividir entre el número de deportes practicados en 2020</w:t>
+      </w:r>
+    </w:p>
+    <w:p>
+      <w:pPr>
+        <w:numPr>
+          <w:ilvl w:val="1"/>
+          <w:numId w:val="1026"/>
+        </w:numPr>
+      </w:pPr>
+      <w:r>
+        <w:t xml:space="preserve">incorrecto, porque se debe multiplicar 0.07 por el número de atletas participantes</w:t>
+      </w:r>
+    </w:p>
+    <w:p>
+      <w:pPr>
+        <w:numPr>
+          <w:ilvl w:val="1"/>
+          <w:numId w:val="1026"/>
+        </w:numPr>
+      </w:pPr>
+      <w:r>
         <w:t xml:space="preserve">insuficiente, porque falta considerar el número total de deportes en el evento</w:t>
       </w:r>
     </w:p>
     <w:p>
       <w:pPr>
         <w:numPr>
-          <w:ilvl w:val="1"/>
-          <w:numId w:val="1026"/>
-        </w:numPr>
-      </w:pPr>
-      <w:r>
-        <w:t xml:space="preserve">suficiente para determinar el número de atletas que participó en atletismo en el año 2027</w:t>
-      </w:r>
-    </w:p>
-    <w:p>
-      <w:pPr>
-        <w:numPr>
-          <w:ilvl w:val="1"/>
-          <w:numId w:val="1026"/>
-        </w:numPr>
-      </w:pPr>
-      <w:r>
-        <w:t xml:space="preserve">incorrecto, porque se debe multiplicar 0.08 por el número de atletas participantes</w:t>
-      </w:r>
-    </w:p>
-    <w:p>
-      <w:pPr>
-        <w:numPr>
           <w:ilvl w:val="0"/>
           <w:numId w:val="1000"/>
         </w:numPr>
@@ -2755,7 +2755,7 @@
         <w:br/>
       </w:r>
       <w:r>
-        <w:t xml:space="preserve">Para resolver este problema, necesitamos evaluar si el procedimiento propuesto para calcular el número de atletas que compiten en atletismo es matemáticamente correcto.</w:t>
+        <w:t xml:space="preserve">Para resolver este problema, necesitamos evaluar si el procedimiento propuesto para calcular el número de atletas que compiten en natación es matemáticamente correcto.</w:t>
       </w:r>
     </w:p>
     <w:p>
@@ -2795,7 +2795,7 @@
         </w:numPr>
       </w:pPr>
       <w:r>
-        <w:t xml:space="preserve">Total de atletas en 2027: 7.483</w:t>
+        <w:t xml:space="preserve">Total de atletas en 2020: 6.464</w:t>
       </w:r>
     </w:p>
     <w:p>
@@ -2806,7 +2806,7 @@
         </w:numPr>
       </w:pPr>
       <w:r>
-        <w:t xml:space="preserve">Porcentaje que compite en atletismo: 8%</w:t>
+        <w:t xml:space="preserve">Porcentaje que compite en natación: 7%</w:t>
       </w:r>
     </w:p>
     <w:p>
@@ -2817,7 +2817,7 @@
         </w:numPr>
       </w:pPr>
       <w:r>
-        <w:t xml:space="preserve">Procedimiento sugerido: multiplicar 0.8 por 7.483</w:t>
+        <w:t xml:space="preserve">Procedimiento sugerido: multiplicar 0.7 por 6.464</w:t>
       </w:r>
     </w:p>
     <w:p>
@@ -2857,7 +2857,7 @@
         </w:numPr>
       </w:pPr>
       <w:r>
-        <w:t xml:space="preserve">El procedimiento propone multiplicar 0.8 por el total de atletas, pero esto es</w:t>
+        <w:t xml:space="preserve">El procedimiento propone multiplicar 0.7 por el total de atletas, pero esto es</w:t>
       </w:r>
       <w:r>
         <w:t xml:space="preserve"> </w:t>
@@ -2907,7 +2907,7 @@
         </w:numPr>
       </w:pPr>
       <w:r>
-        <w:t xml:space="preserve">8% = 0.08 (no 0.8)</w:t>
+        <w:t xml:space="preserve">7% = 0.07 (no 0.7)</w:t>
       </w:r>
     </w:p>
     <w:p>
@@ -2928,7 +2928,7 @@
         <w:t xml:space="preserve"> </w:t>
       </w:r>
       <w:r>
-        <w:t xml:space="preserve">8% de 7.483 = 0.08 × 7.483 = 599</w:t>
+        <w:t xml:space="preserve">7% de 6.464 = 0.07 × 6.464 = 452</w:t>
       </w:r>
     </w:p>
     <w:p>
@@ -2949,7 +2949,7 @@
         <w:t xml:space="preserve"> </w:t>
       </w:r>
       <w:r>
-        <w:t xml:space="preserve">0.8 × 7.483 = 5.986 (esto sería el 80%, no el 8%)</w:t>
+        <w:t xml:space="preserve">0.7 × 6.464 = 4.525 (esto sería el 70%, no el 7%)</w:t>
       </w:r>
     </w:p>
     <w:p>
@@ -3016,7 +3016,7 @@
         </w:numPr>
       </w:pPr>
       <w:r>
-        <w:t xml:space="preserve">El valor 0.8 corresponde al 80%, no al 8%</w:t>
+        <w:t xml:space="preserve">El valor 0.7 corresponde al 70%, no al 7%</w:t>
       </w:r>
     </w:p>
     <w:p>
@@ -3027,7 +3027,7 @@
         </w:numPr>
       </w:pPr>
       <w:r>
-        <w:t xml:space="preserve">Para calcular el 8% se debe usar 0.08, no 0.8</w:t>
+        <w:t xml:space="preserve">Para calcular el 7% se debe usar 0.07, no 0.7</w:t>
       </w:r>
     </w:p>
     <w:p>
@@ -3208,7 +3208,7 @@
         <w:t xml:space="preserve"> </w:t>
       </w:r>
       <w:r>
-        <w:t xml:space="preserve">porque usa 0.8 en lugar de 0.08. La respuesta correcta identifica este error y proporciona el valor decimal correcto que debe usarse.</w:t>
+        <w:t xml:space="preserve">porque usa 0.7 en lugar de 0.07. La respuesta correcta identifica este error y proporciona el valor decimal correcto que debe usarse.</w:t>
       </w:r>
     </w:p>
     <w:p>
@@ -3241,18 +3241,18 @@
         </w:numPr>
       </w:pPr>
       <w:r>
+        <w:t xml:space="preserve">Verdadero</w:t>
+      </w:r>
+    </w:p>
+    <w:p>
+      <w:pPr>
+        <w:numPr>
+          <w:ilvl w:val="1"/>
+          <w:numId w:val="1031"/>
+        </w:numPr>
+      </w:pPr>
+      <w:r>
         <w:t xml:space="preserve">Falso</w:t>
-      </w:r>
-    </w:p>
-    <w:p>
-      <w:pPr>
-        <w:numPr>
-          <w:ilvl w:val="1"/>
-          <w:numId w:val="1031"/>
-        </w:numPr>
-      </w:pPr>
-      <w:r>
-        <w:t xml:space="preserve">Verdadero</w:t>
       </w:r>
     </w:p>
     <w:bookmarkEnd w:id="55"/>

</xml_diff>